<commit_message>
F31: reframe completed results as preliminary data throughout; fix timeline and EHR extensibility consistency
</commit_message>
<xml_diff>
--- a/f31_proposal/output/F31_Dixon_Proposal.docx
+++ b/f31_proposal/output/F31_Dixon_Proposal.docx
@@ -226,13 +226,13 @@
         <w:t xml:space="preserve"> </w:t>
       </w:r>
       <w:r>
-        <w:t xml:space="preserve">framework to reduce preventable mortality associated with polypharmacy and the</w:t>
-      </w:r>
-      <w:r>
-        <w:t xml:space="preserve"> </w:t>
-      </w:r>
-      <w:r>
-        <w:t xml:space="preserve">opioid epidemic.</w:t>
+        <w:t xml:space="preserve">framework to reduce preventable emergency room visits associated with polypharmacy</w:t>
+      </w:r>
+      <w:r>
+        <w:t xml:space="preserve"> </w:t>
+      </w:r>
+      <w:r>
+        <w:t xml:space="preserve">and the opioid epidemic.</w:t>
       </w:r>
     </w:p>
     <w:p>
@@ -319,13 +319,19 @@
         <w:t xml:space="preserve"> </w:t>
       </w:r>
       <w:r>
-        <w:t xml:space="preserve">support, suitable for adoption by community pharmacies and Safety Net hospitals</w:t>
-      </w:r>
-      <w:r>
-        <w:t xml:space="preserve"> </w:t>
-      </w:r>
-      <w:r>
-        <w:t xml:space="preserve">without EHR integration.</w:t>
+        <w:t xml:space="preserve">support, suitable for adoption by community pharmacies and Safety Net hospitals.</w:t>
+      </w:r>
+      <w:r>
+        <w:t xml:space="preserve"> </w:t>
+      </w:r>
+      <w:r>
+        <w:t xml:space="preserve">The serverless architecture is designed to accept EHR-derived inputs as an optional</w:t>
+      </w:r>
+      <w:r>
+        <w:t xml:space="preserve"> </w:t>
+      </w:r>
+      <w:r>
+        <w:t xml:space="preserve">future extension, though claims data alone are sufficient for full functionality.</w:t>
       </w:r>
     </w:p>
     <w:p>
@@ -364,31 +370,31 @@
         <w:t xml:space="preserve"> </w:t>
       </w:r>
       <w:r>
-        <w:t xml:space="preserve">Develop an ensemble model (CatBoost/XGBoost) to predict opioid-related</w:t>
-      </w:r>
-      <w:r>
-        <w:t xml:space="preserve"> </w:t>
-      </w:r>
-      <w:r>
-        <w:t xml:space="preserve">ED visits across seven age bands (13–114) using a strict 2019 prospective holdout.</w:t>
-      </w:r>
-      <w:r>
-        <w:t xml:space="preserve"> </w:t>
-      </w:r>
-      <w:r>
-        <w:t xml:space="preserve">The Consensus-Causal Filter (SHAP ∩ FFA) will isolate modifiable causal features</w:t>
-      </w:r>
-      <w:r>
-        <w:t xml:space="preserve"> </w:t>
-      </w:r>
-      <w:r>
-        <w:t xml:space="preserve">from correlated documentation artifacts. Dynamic Time Warping (DTW) clustering</w:t>
-      </w:r>
-      <w:r>
-        <w:t xml:space="preserve"> </w:t>
-      </w:r>
-      <w:r>
-        <w:t xml:space="preserve">will identify</w:t>
+        <w:t xml:space="preserve">Pilot ensemble models (CatBoost/XGBoost/XGBoost-RF) have been trained</w:t>
+      </w:r>
+      <w:r>
+        <w:t xml:space="preserve"> </w:t>
+      </w:r>
+      <w:r>
+        <w:t xml:space="preserve">across seven age bands (13–114), achieving AUROC ≥ 0.95 and PR-AUC ≥ 0.84 on</w:t>
+      </w:r>
+      <w:r>
+        <w:t xml:space="preserve"> </w:t>
+      </w:r>
+      <w:r>
+        <w:t xml:space="preserve">2016–2018 cross-validation sets. The Consensus-Causal Filter (SHAP ∩ FFA) has</w:t>
+      </w:r>
+      <w:r>
+        <w:t xml:space="preserve"> </w:t>
+      </w:r>
+      <w:r>
+        <w:t xml:space="preserve">isolated modifiable causal features from correlated documentation artifacts.</w:t>
+      </w:r>
+      <w:r>
+        <w:t xml:space="preserve"> </w:t>
+      </w:r>
+      <w:r>
+        <w:t xml:space="preserve">Pilot DTW clustering has already identified two trajectory archetypes —</w:t>
       </w:r>
       <w:r>
         <w:t xml:space="preserve"> </w:t>
@@ -404,7 +410,7 @@
         <w:t xml:space="preserve"> </w:t>
       </w:r>
       <w:r>
-        <w:t xml:space="preserve">(4.2-month) and</w:t>
+        <w:t xml:space="preserve">(4.2-month escalation window) and</w:t>
       </w:r>
       <w:r>
         <w:t xml:space="preserve"> </w:t>
@@ -420,13 +426,19 @@
         <w:t xml:space="preserve"> </w:t>
       </w:r>
       <w:r>
-        <w:t xml:space="preserve">(22.1-month)</w:t>
-      </w:r>
-      <w:r>
-        <w:t xml:space="preserve"> </w:t>
-      </w:r>
-      <w:r>
-        <w:t xml:space="preserve">trajectory archetypes to guide the timing of clinical interventions.</w:t>
+        <w:t xml:space="preserve">(22.1-month window). The deliverable is prospective validation of all models</w:t>
+      </w:r>
+      <w:r>
+        <w:t xml:space="preserve"> </w:t>
+      </w:r>
+      <w:r>
+        <w:t xml:space="preserve">and archetypes against the strict 2019 holdout to confirm generalizability</w:t>
+      </w:r>
+      <w:r>
+        <w:t xml:space="preserve"> </w:t>
+      </w:r>
+      <w:r>
+        <w:t xml:space="preserve">and guide the timing of clinical interventions.</w:t>
       </w:r>
     </w:p>
     <w:p>
@@ -438,25 +450,47 @@
           <w:i/>
           <w:iCs/>
         </w:rPr>
-        <w:t xml:space="preserve">Expected Outcome:</w:t>
-      </w:r>
-      <w:r>
-        <w:t xml:space="preserve"> </w:t>
-      </w:r>
-      <w:r>
-        <w:t xml:space="preserve">Ensemble models with AUROC ≥ 0.95 and PR-AUC ≥ 0.84 across</w:t>
-      </w:r>
-      <w:r>
-        <w:t xml:space="preserve"> </w:t>
-      </w:r>
-      <w:r>
-        <w:t xml:space="preserve">all seven age bands, with DTW archetypes providing intervention windows validated</w:t>
-      </w:r>
-      <w:r>
-        <w:t xml:space="preserve"> </w:t>
-      </w:r>
-      <w:r>
-        <w:t xml:space="preserve">against 2019 holdout trajectory concordance.</w:t>
+        <w:t xml:space="preserve">Preliminary Results:</w:t>
+      </w:r>
+      <w:r>
+        <w:t xml:space="preserve"> </w:t>
+      </w:r>
+      <w:r>
+        <w:t xml:space="preserve">AUROC ≥ 0.95 and PR-AUC ≥ 0.84 across all seven age</w:t>
+      </w:r>
+      <w:r>
+        <w:t xml:space="preserve"> </w:t>
+      </w:r>
+      <w:r>
+        <w:t xml:space="preserve">bands on internal cross-validation; DTW archetypes reproduced across three</w:t>
+      </w:r>
+      <w:r>
+        <w:t xml:space="preserve"> </w:t>
+      </w:r>
+      <w:r>
+        <w:t xml:space="preserve">independent cohort splits.</w:t>
+      </w:r>
+      <w:r>
+        <w:t xml:space="preserve"> </w:t>
+      </w:r>
+      <w:r>
+        <w:rPr>
+          <w:i/>
+          <w:iCs/>
+        </w:rPr>
+        <w:t xml:space="preserve">Deliverable:</w:t>
+      </w:r>
+      <w:r>
+        <w:t xml:space="preserve"> </w:t>
+      </w:r>
+      <w:r>
+        <w:t xml:space="preserve">Prospective 2019 holdout validation</w:t>
+      </w:r>
+      <w:r>
+        <w:t xml:space="preserve"> </w:t>
+      </w:r>
+      <w:r>
+        <w:t xml:space="preserve">and archetype concordance confirmation.</w:t>
       </w:r>
     </w:p>
     <w:p>
@@ -523,31 +557,61 @@
         <w:t xml:space="preserve"> </w:t>
       </w:r>
       <w:r>
-        <w:t xml:space="preserve">Extend FFA to identify synergistic drug-drug interactions (e.g.,</w:t>
-      </w:r>
-      <w:r>
-        <w:t xml:space="preserve"> </w:t>
-      </w:r>
-      <w:r>
-        <w:t xml:space="preserve">Acetaminophen + Levofloxacin, IE = 16.3) in geriatric populations using FP-Growth</w:t>
-      </w:r>
-      <w:r>
-        <w:t xml:space="preserve"> </w:t>
-      </w:r>
-      <w:r>
-        <w:t xml:space="preserve">co-occurrence networks and Interaction Effect (IE) scoring. Quantify Intervention</w:t>
-      </w:r>
-      <w:r>
-        <w:t xml:space="preserve"> </w:t>
-      </w:r>
-      <w:r>
-        <w:t xml:space="preserve">Rate (IR) scores to rank deprescribing priorities based on expected risk reduction</w:t>
-      </w:r>
-      <w:r>
-        <w:t xml:space="preserve"> </w:t>
-      </w:r>
-      <w:r>
-        <w:t xml:space="preserve">per patient exposure.</w:t>
+        <w:t xml:space="preserve">FFA multi-feature interaction testing has already identified 115</w:t>
+      </w:r>
+      <w:r>
+        <w:t xml:space="preserve"> </w:t>
+      </w:r>
+      <w:r>
+        <w:t xml:space="preserve">synergistic drug-drug interactions in geriatric populations, including</w:t>
+      </w:r>
+      <w:r>
+        <w:t xml:space="preserve"> </w:t>
+      </w:r>
+      <w:r>
+        <w:t xml:space="preserve">Acetaminophen + Levofloxacin (IE = 16.3) and Levofloxacin + Lorazepam</w:t>
+      </w:r>
+      <w:r>
+        <w:t xml:space="preserve"> </w:t>
+      </w:r>
+      <w:r>
+        <w:t xml:space="preserve">(IE = 11.9), invisible to standard pairwise DDI databases. Intervention Rate</w:t>
+      </w:r>
+      <w:r>
+        <w:t xml:space="preserve"> </w:t>
+      </w:r>
+      <w:r>
+        <w:t xml:space="preserve">(IR) scores have ranked deprescribing priorities (simvastatin IR 7.0×10⁻⁴,</w:t>
+      </w:r>
+      <w:r>
+        <w:t xml:space="preserve"> </w:t>
+      </w:r>
+      <w:r>
+        <w:t xml:space="preserve">furosemide IR 2.0×10⁻⁴, alprazolam IR 1.0×10⁻⁴). Z-code monitoring analysis</w:t>
+      </w:r>
+      <w:r>
+        <w:t xml:space="preserve"> </w:t>
+      </w:r>
+      <w:r>
+        <w:t xml:space="preserve">has identified a U-shaped effect distinguishing protectively monitored (Q2;</w:t>
+      </w:r>
+      <w:r>
+        <w:t xml:space="preserve"> </w:t>
+      </w:r>
+      <w:r>
+        <w:t xml:space="preserve">OR = 0.25) from fragmented-care (Q4; OR ≈ 0.94) polypharmacy phenotypes.</w:t>
+      </w:r>
+      <w:r>
+        <w:t xml:space="preserve"> </w:t>
+      </w:r>
+      <w:r>
+        <w:t xml:space="preserve">The deliverable is prospective holdout validation of IR rankings and</w:t>
+      </w:r>
+      <w:r>
+        <w:t xml:space="preserve"> </w:t>
+      </w:r>
+      <w:r>
+        <w:t xml:space="preserve">peer-reviewed publication of the causal calculator framework.</w:t>
       </w:r>
     </w:p>
     <w:p>
@@ -559,31 +623,35 @@
           <w:i/>
           <w:iCs/>
         </w:rPr>
-        <w:t xml:space="preserve">Expected Outcome:</w:t>
-      </w:r>
-      <w:r>
-        <w:t xml:space="preserve"> </w:t>
-      </w:r>
-      <w:r>
-        <w:t xml:space="preserve">Identification of ≥100 synergistic drug pairs, IR-ranked</w:t>
-      </w:r>
-      <w:r>
-        <w:t xml:space="preserve"> </w:t>
-      </w:r>
-      <w:r>
-        <w:t xml:space="preserve">deprescribing targets actionable from standard claims data, and a validated Z-code</w:t>
-      </w:r>
-      <w:r>
-        <w:t xml:space="preserve"> </w:t>
-      </w:r>
-      <w:r>
-        <w:t xml:space="preserve">monitoring analysis distinguishing managed from fragmented-care polypharmacy</w:t>
-      </w:r>
-      <w:r>
-        <w:t xml:space="preserve"> </w:t>
-      </w:r>
-      <w:r>
-        <w:t xml:space="preserve">phenotypes.</w:t>
+        <w:t xml:space="preserve">Preliminary Results:</w:t>
+      </w:r>
+      <w:r>
+        <w:t xml:space="preserve"> </w:t>
+      </w:r>
+      <w:r>
+        <w:t xml:space="preserve">115 synergistic pairs and 5,021 high-risk triplets</w:t>
+      </w:r>
+      <w:r>
+        <w:t xml:space="preserve"> </w:t>
+      </w:r>
+      <w:r>
+        <w:t xml:space="preserve">identified; IR-ranked deprescribing targets confirmed across three age bands.</w:t>
+      </w:r>
+      <w:r>
+        <w:t xml:space="preserve"> </w:t>
+      </w:r>
+      <w:r>
+        <w:rPr>
+          <w:i/>
+          <w:iCs/>
+        </w:rPr>
+        <w:t xml:space="preserve">Deliverable:</w:t>
+      </w:r>
+      <w:r>
+        <w:t xml:space="preserve"> </w:t>
+      </w:r>
+      <w:r>
+        <w:t xml:space="preserve">Prospective validation and dissemination.</w:t>
       </w:r>
     </w:p>
     <w:p>
@@ -608,13 +676,19 @@
         <w:t xml:space="preserve"> </w:t>
       </w:r>
       <w:r>
-        <w:t xml:space="preserve">Deploy a serverless PGx Risk Dashboard on AWS Lambda bundling up to 84 per-bin</w:t>
-      </w:r>
-      <w:r>
-        <w:t xml:space="preserve"> </w:t>
-      </w:r>
-      <w:r>
-        <w:t xml:space="preserve">ensemble models. Implement</w:t>
+        <w:t xml:space="preserve">The serverless PGx Risk Dashboard has been deployed on AWS Lambda, bundling</w:t>
+      </w:r>
+      <w:r>
+        <w:t xml:space="preserve"> </w:t>
+      </w:r>
+      <w:r>
+        <w:t xml:space="preserve">up to 84 per-bin ensemble models, a CPIC snapshot (573 Level A/B gene-drug</w:t>
+      </w:r>
+      <w:r>
+        <w:t xml:space="preserve"> </w:t>
+      </w:r>
+      <w:r>
+        <w:t xml:space="preserve">pairs), and per-band density thresholds.</w:t>
       </w:r>
       <w:r>
         <w:t xml:space="preserve"> </w:t>
@@ -630,25 +704,25 @@
         <w:t xml:space="preserve"> </w:t>
       </w:r>
       <w:r>
-        <w:t xml:space="preserve">to maintain risk-band</w:t>
-      </w:r>
-      <w:r>
-        <w:t xml:space="preserve"> </w:t>
-      </w:r>
-      <w:r>
-        <w:t xml:space="preserve">stability up to 60% input sparsity. Integrate CPIC Level A/B pharmacogenomic</w:t>
-      </w:r>
-      <w:r>
-        <w:t xml:space="preserve"> </w:t>
-      </w:r>
-      <w:r>
-        <w:t xml:space="preserve">guidance via a stateless, ephemeral gene-drug lookup card satisfying HIPAA</w:t>
-      </w:r>
-      <w:r>
-        <w:t xml:space="preserve"> </w:t>
-      </w:r>
-      <w:r>
-        <w:t xml:space="preserve">minimum-necessary (45 CFR § 164.502(b)).</w:t>
+        <w:t xml:space="preserve">maintains</w:t>
+      </w:r>
+      <w:r>
+        <w:t xml:space="preserve"> </w:t>
+      </w:r>
+      <w:r>
+        <w:t xml:space="preserve">risk-band stability at ≥ 87% of patients at 50% input sparsity. The</w:t>
+      </w:r>
+      <w:r>
+        <w:t xml:space="preserve"> </w:t>
+      </w:r>
+      <w:r>
+        <w:t xml:space="preserve">stateless CPIC PGx card satisfies HIPAA minimum-necessary</w:t>
+      </w:r>
+      <w:r>
+        <w:t xml:space="preserve"> </w:t>
+      </w:r>
+      <w:r>
+        <w:t xml:space="preserve">(45 CFR § 164.502(b)) architecturally.</w:t>
       </w:r>
     </w:p>
     <w:p>
@@ -660,25 +734,53 @@
           <w:i/>
           <w:iCs/>
         </w:rPr>
-        <w:t xml:space="preserve">Expected Outcome:</w:t>
-      </w:r>
-      <w:r>
-        <w:t xml:space="preserve"> </w:t>
-      </w:r>
-      <w:r>
-        <w:t xml:space="preserve">Production-deployed dashboard achieving warm inference ≤ 100 ms,</w:t>
-      </w:r>
-      <w:r>
-        <w:t xml:space="preserve"> </w:t>
-      </w:r>
-      <w:r>
-        <w:t xml:space="preserve">cold-start ≤ 3,000 ms, 100% CPIC concordance across 573 test cases, and risk-band</w:t>
-      </w:r>
-      <w:r>
-        <w:t xml:space="preserve"> </w:t>
-      </w:r>
-      <w:r>
-        <w:t xml:space="preserve">stability at ≥ 87% of patients at 50% input sparsity.</w:t>
+        <w:t xml:space="preserve">Preliminary Results:</w:t>
+      </w:r>
+      <w:r>
+        <w:t xml:space="preserve"> </w:t>
+      </w:r>
+      <w:r>
+        <w:t xml:space="preserve">Warm inference ≤ 100 ms; cold-start ≤ 3,000 ms;</w:t>
+      </w:r>
+      <w:r>
+        <w:t xml:space="preserve"> </w:t>
+      </w:r>
+      <w:r>
+        <w:t xml:space="preserve">100% CPIC concordance across 573 test cases; risk-band stability ≥ 87% at</w:t>
+      </w:r>
+      <w:r>
+        <w:t xml:space="preserve"> </w:t>
+      </w:r>
+      <w:r>
+        <w:t xml:space="preserve">50% input sparsity confirmed in load testing.</w:t>
+      </w:r>
+      <w:r>
+        <w:t xml:space="preserve"> </w:t>
+      </w:r>
+      <w:r>
+        <w:rPr>
+          <w:i/>
+          <w:iCs/>
+        </w:rPr>
+        <w:t xml:space="preserve">Deliverable:</w:t>
+      </w:r>
+      <w:r>
+        <w:t xml:space="preserve"> </w:t>
+      </w:r>
+      <w:r>
+        <w:t xml:space="preserve">Ongoing</w:t>
+      </w:r>
+      <w:r>
+        <w:t xml:space="preserve"> </w:t>
+      </w:r>
+      <w:r>
+        <w:t xml:space="preserve">reliability monitoring, EHR input extension, and peer-reviewed publication</w:t>
+      </w:r>
+      <w:r>
+        <w:t xml:space="preserve"> </w:t>
+      </w:r>
+      <w:r>
+        <w:t xml:space="preserve">of the deployment architecture.</w:t>
       </w:r>
     </w:p>
     <w:p>
@@ -1563,7 +1665,43 @@
               <w:jc w:val="left"/>
             </w:pPr>
             <w:r>
-              <w:t xml:space="preserve">Complete Aims 1 &amp; 2 model training; qualify; submit CH_1–CH_2 to journals</w:t>
+              <w:t xml:space="preserve">Aims 1 &amp; 2 model training</w:t>
+            </w:r>
+            <w:r>
+              <w:t xml:space="preserve"> </w:t>
+            </w:r>
+            <w:r>
+              <w:rPr>
+                <w:i/>
+                <w:iCs/>
+              </w:rPr>
+              <w:t xml:space="preserve">(complete)</w:t>
+            </w:r>
+            <w:r>
+              <w:t xml:space="preserve">; CH_1–CH_2 submitted</w:t>
+            </w:r>
+            <w:r>
+              <w:t xml:space="preserve"> </w:t>
+            </w:r>
+            <w:r>
+              <w:rPr>
+                <w:i/>
+                <w:iCs/>
+              </w:rPr>
+              <w:t xml:space="preserve">(complete)</w:t>
+            </w:r>
+            <w:r>
+              <w:t xml:space="preserve">; Qualifying Exam</w:t>
+            </w:r>
+            <w:r>
+              <w:t xml:space="preserve"> </w:t>
+            </w:r>
+            <w:r>
+              <w:rPr>
+                <w:i/>
+                <w:iCs/>
+              </w:rPr>
+              <w:t xml:space="preserve">(in progress)</w:t>
             </w:r>
           </w:p>
         </w:tc>
@@ -1593,7 +1731,33 @@
               <w:jc w:val="left"/>
             </w:pPr>
             <w:r>
-              <w:t xml:space="preserve">Dashboard deployment (Aim 3); submit CH_3–CH_5; dissertation defense (June 2026)</w:t>
+              <w:t xml:space="preserve">Dashboard deployed</w:t>
+            </w:r>
+            <w:r>
+              <w:t xml:space="preserve"> </w:t>
+            </w:r>
+            <w:r>
+              <w:rPr>
+                <w:i/>
+                <w:iCs/>
+              </w:rPr>
+              <w:t xml:space="preserve">(complete)</w:t>
+            </w:r>
+            <w:r>
+              <w:t xml:space="preserve">; CH_3–CH_5 submitted</w:t>
+            </w:r>
+            <w:r>
+              <w:t xml:space="preserve"> </w:t>
+            </w:r>
+            <w:r>
+              <w:rPr>
+                <w:i/>
+                <w:iCs/>
+              </w:rPr>
+              <w:t xml:space="preserve">(in progress)</w:t>
+            </w:r>
+            <w:r>
+              <w:t xml:space="preserve">; dissertation defense (June 2026)</w:t>
             </w:r>
           </w:p>
         </w:tc>
@@ -2832,7 +2996,19 @@
         <w:t xml:space="preserve"> </w:t>
       </w:r>
       <w:r>
-        <w:t xml:space="preserve">infrastructure, with no proprietary EHR integration required.</w:t>
+        <w:t xml:space="preserve">infrastructure. The architecture is extensible to EHR-derived inputs as</w:t>
+      </w:r>
+      <w:r>
+        <w:t xml:space="preserve"> </w:t>
+      </w:r>
+      <w:r>
+        <w:t xml:space="preserve">additional data sources become available, without requiring proprietary</w:t>
+      </w:r>
+      <w:r>
+        <w:t xml:space="preserve"> </w:t>
+      </w:r>
+      <w:r>
+        <w:t xml:space="preserve">integration as a prerequisite.</w:t>
       </w:r>
     </w:p>
     <w:p>

</xml_diff>

<commit_message>
F31: add all 3 AWS certs to refs.bib; map ML Specialty->Aims1-3, Solutions Architect->Aim3, Big Data->Aims1-2 in training plan
</commit_message>
<xml_diff>
--- a/f31_proposal/output/F31_Dixon_Proposal.docx
+++ b/f31_proposal/output/F31_Dixon_Proposal.docx
@@ -2219,19 +2219,37 @@
         <w:t xml:space="preserve"> </w:t>
       </w:r>
       <w:r>
-        <w:t xml:space="preserve">AWS Certified Machine Learning – Specialty validates</w:t>
-      </w:r>
-      <w:r>
-        <w:t xml:space="preserve"> </w:t>
-      </w:r>
-      <w:r>
-        <w:t xml:space="preserve">expertise in designing, deploying, and monitoring large-scale inference pipelines</w:t>
-      </w:r>
-      <w:r>
-        <w:t xml:space="preserve"> </w:t>
-      </w:r>
-      <w:r>
-        <w:t xml:space="preserve">and stratified ensemble models across age bands and risk strata.</w:t>
+        <w:t xml:space="preserve">AWS Certified Machine Learning – Specialty</w:t>
+      </w:r>
+      <w:r>
+        <w:rPr>
+          <w:vertAlign w:val="superscript"/>
+        </w:rPr>
+        <w:t xml:space="preserve">6</w:t>
+      </w:r>
+      <w:r>
+        <w:t xml:space="preserve"> </w:t>
+      </w:r>
+      <w:r>
+        <w:t xml:space="preserve">validates expertise in designing, deploying, and monitoring</w:t>
+      </w:r>
+      <w:r>
+        <w:t xml:space="preserve"> </w:t>
+      </w:r>
+      <w:r>
+        <w:t xml:space="preserve">large-scale inference pipelines and stratified ensemble models across age bands</w:t>
+      </w:r>
+      <w:r>
+        <w:t xml:space="preserve"> </w:t>
+      </w:r>
+      <w:r>
+        <w:t xml:space="preserve">and risk strata. Directly maps to Aims 1 &amp; 2 (per-bin ensemble training and</w:t>
+      </w:r>
+      <w:r>
+        <w:t xml:space="preserve"> </w:t>
+      </w:r>
+      <w:r>
+        <w:t xml:space="preserve">Optuna-tuned model selection) and Aim 3 (Lambda inference pipeline).</w:t>
       </w:r>
     </w:p>
     <w:bookmarkEnd w:id="34"/>
@@ -2283,16 +2301,34 @@
           <w:b/>
           <w:bCs/>
         </w:rPr>
-        <w:t xml:space="preserve">AWS Certified Big Data Analytics</w:t>
-      </w:r>
-      <w:r>
-        <w:t xml:space="preserve">: Expertise in scaling analytical workloads</w:t>
-      </w:r>
-      <w:r>
-        <w:t xml:space="preserve"> </w:t>
-      </w:r>
-      <w:r>
-        <w:t xml:space="preserve">(DuckDB and S3 data lakes) to achieve the 15.1× throughput improvement.</w:t>
+        <w:t xml:space="preserve">AWS Certified Solutions Architect – Associate</w:t>
+      </w:r>
+      <w:r>
+        <w:rPr>
+          <w:vertAlign w:val="superscript"/>
+        </w:rPr>
+        <w:t xml:space="preserve">7</w:t>
+      </w:r>
+      <w:r>
+        <w:t xml:space="preserve">:</w:t>
+      </w:r>
+      <w:r>
+        <w:t xml:space="preserve"> </w:t>
+      </w:r>
+      <w:r>
+        <w:t xml:space="preserve">Provides the architectural foundation for deploying the serverless PGx Risk</w:t>
+      </w:r>
+      <w:r>
+        <w:t xml:space="preserve"> </w:t>
+      </w:r>
+      <w:r>
+        <w:t xml:space="preserve">Dashboard on AWS Lambda with ephemeral, stateless compute, ECR container</w:t>
+      </w:r>
+      <w:r>
+        <w:t xml:space="preserve"> </w:t>
+      </w:r>
+      <w:r>
+        <w:t xml:space="preserve">management, and CI/CD integration via GitHub Actions. Directly maps to Aim 3.</w:t>
       </w:r>
     </w:p>
     <w:p>
@@ -2308,16 +2344,34 @@
           <w:b/>
           <w:bCs/>
         </w:rPr>
-        <w:t xml:space="preserve">AWS Certified Solutions Architect</w:t>
-      </w:r>
-      <w:r>
-        <w:t xml:space="preserve">: Technical basis for deploying the serverless</w:t>
-      </w:r>
-      <w:r>
-        <w:t xml:space="preserve"> </w:t>
-      </w:r>
-      <w:r>
-        <w:t xml:space="preserve">PGx Risk Dashboard using the ephemeral AWS Lambda architecture.</w:t>
+        <w:t xml:space="preserve">AWS Certified Big Data – Specialty</w:t>
+      </w:r>
+      <w:r>
+        <w:rPr>
+          <w:vertAlign w:val="superscript"/>
+        </w:rPr>
+        <w:t xml:space="preserve">8</w:t>
+      </w:r>
+      <w:r>
+        <w:t xml:space="preserve">: Validates expertise in</w:t>
+      </w:r>
+      <w:r>
+        <w:t xml:space="preserve"> </w:t>
+      </w:r>
+      <w:r>
+        <w:t xml:space="preserve">orchestrating large-scale analytical workloads across S3 data lakes and</w:t>
+      </w:r>
+      <w:r>
+        <w:t xml:space="preserve"> </w:t>
+      </w:r>
+      <w:r>
+        <w:t xml:space="preserve">partitioned DuckDB workers, enabling the 15.1× throughput improvement in the</w:t>
+      </w:r>
+      <w:r>
+        <w:t xml:space="preserve"> </w:t>
+      </w:r>
+      <w:r>
+        <w:t xml:space="preserve">Bronze-to-Gold APCD pipeline. Directly maps to Aims 1 &amp; 2 data architecture.</w:t>
       </w:r>
     </w:p>
     <w:p>
@@ -3259,7 +3313,7 @@
     </w:p>
     <w:bookmarkEnd w:id="46"/>
     <w:bookmarkEnd w:id="47"/>
-    <w:bookmarkStart w:id="54" w:name="references"/>
+    <w:bookmarkStart w:id="57" w:name="references"/>
     <w:p>
       <w:pPr>
         <w:pStyle w:val="Heading1"/>
@@ -3268,7 +3322,7 @@
         <w:t xml:space="preserve">References</w:t>
       </w:r>
     </w:p>
-    <w:bookmarkStart w:id="53" w:name="refs"/>
+    <w:bookmarkStart w:id="56" w:name="refs"/>
     <w:bookmarkStart w:id="48" w:name="ref-Rajpurkar2022"/>
     <w:p>
       <w:pPr>
@@ -3416,8 +3470,92 @@
       </w:r>
     </w:p>
     <w:bookmarkEnd w:id="52"/>
+    <w:bookmarkStart w:id="53" w:name="ref-AWS_ML_Specialty"/>
+    <w:p>
+      <w:pPr>
+        <w:pStyle w:val="Bibliography"/>
+      </w:pPr>
+      <w:r>
+        <w:t xml:space="preserve">6.</w:t>
+      </w:r>
+      <w:r>
+        <w:t xml:space="preserve"> </w:t>
+      </w:r>
+      <w:r>
+        <w:t xml:space="preserve">	</w:t>
+      </w:r>
+      <w:r>
+        <w:t xml:space="preserve">Amazon Web Services.</w:t>
+      </w:r>
+      <w:r>
+        <w:t xml:space="preserve"> </w:t>
+      </w:r>
+      <w:r>
+        <w:t xml:space="preserve">AWS Certified Machine Learning – Specialty</w:t>
+      </w:r>
+      <w:r>
+        <w:t xml:space="preserve">. Published online 2022.</w:t>
+      </w:r>
+    </w:p>
     <w:bookmarkEnd w:id="53"/>
+    <w:bookmarkStart w:id="54" w:name="ref-AWS_Solutions_Architect"/>
+    <w:p>
+      <w:pPr>
+        <w:pStyle w:val="Bibliography"/>
+      </w:pPr>
+      <w:r>
+        <w:t xml:space="preserve">7.</w:t>
+      </w:r>
+      <w:r>
+        <w:t xml:space="preserve"> </w:t>
+      </w:r>
+      <w:r>
+        <w:t xml:space="preserve">	</w:t>
+      </w:r>
+      <w:r>
+        <w:t xml:space="preserve">Amazon Web Services.</w:t>
+      </w:r>
+      <w:r>
+        <w:t xml:space="preserve"> </w:t>
+      </w:r>
+      <w:r>
+        <w:t xml:space="preserve">AWS Certified Solutions Architect – Associate</w:t>
+      </w:r>
+      <w:r>
+        <w:t xml:space="preserve">. Published online 2021.</w:t>
+      </w:r>
+    </w:p>
     <w:bookmarkEnd w:id="54"/>
+    <w:bookmarkStart w:id="55" w:name="ref-AWS_Big_Data"/>
+    <w:p>
+      <w:pPr>
+        <w:pStyle w:val="Bibliography"/>
+      </w:pPr>
+      <w:r>
+        <w:t xml:space="preserve">8.</w:t>
+      </w:r>
+      <w:r>
+        <w:t xml:space="preserve"> </w:t>
+      </w:r>
+      <w:r>
+        <w:t xml:space="preserve">	</w:t>
+      </w:r>
+      <w:r>
+        <w:t xml:space="preserve">Amazon Web Services.</w:t>
+      </w:r>
+      <w:r>
+        <w:t xml:space="preserve"> </w:t>
+      </w:r>
+      <w:r>
+        <w:t xml:space="preserve">AWS Certified Big Data – Specialty</w:t>
+      </w:r>
+      <w:r>
+        <w:t xml:space="preserve">. Published online 2021.</w:t>
+      </w:r>
+    </w:p>
+    <w:bookmarkEnd w:id="55"/>
+    <w:bookmarkEnd w:id="56"/>
+    <w:bookmarkEnd w:id="57"/>
     <w:sectPr>
       <w:footnotePr>
         <w:numRestart w:val="eachSect"/>

</xml_diff>

<commit_message>
F31: fix HGEN 611/619 descriptions, add HGEN 612 (Spring 2021), remove EHR from Aim 3 deliverable, remove EHR input extension
</commit_message>
<xml_diff>
--- a/f31_proposal/output/F31_Dixon_Proposal.docx
+++ b/f31_proposal/output/F31_Dixon_Proposal.docx
@@ -774,13 +774,13 @@
         <w:t xml:space="preserve"> </w:t>
       </w:r>
       <w:r>
-        <w:t xml:space="preserve">reliability monitoring, EHR input extension, and peer-reviewed publication</w:t>
-      </w:r>
-      <w:r>
-        <w:t xml:space="preserve"> </w:t>
-      </w:r>
-      <w:r>
-        <w:t xml:space="preserve">of the deployment architecture.</w:t>
+        <w:t xml:space="preserve">reliability monitoring and peer-reviewed publication of the deployment</w:t>
+      </w:r>
+      <w:r>
+        <w:t xml:space="preserve"> </w:t>
+      </w:r>
+      <w:r>
+        <w:t xml:space="preserve">architecture.</w:t>
       </w:r>
     </w:p>
     <w:p>
@@ -1870,13 +1870,37 @@
         <w:t xml:space="preserve"> </w:t>
       </w:r>
       <w:r>
-        <w:t xml:space="preserve">(Fall 2018, B): Computational foundation for</w:t>
-      </w:r>
-      <w:r>
-        <w:t xml:space="preserve"> </w:t>
-      </w:r>
-      <w:r>
-        <w:t xml:space="preserve">high-throughput genomic and claims-based data engineering.</w:t>
+        <w:t xml:space="preserve">(Fall 2018, B): R-based reproducible scientific</w:t>
+      </w:r>
+      <w:r>
+        <w:t xml:space="preserve"> </w:t>
+      </w:r>
+      <w:r>
+        <w:t xml:space="preserve">computing covering data acquisition, cleaning, reshaping, manipulation, analysis,</w:t>
+      </w:r>
+      <w:r>
+        <w:t xml:space="preserve"> </w:t>
+      </w:r>
+      <w:r>
+        <w:t xml:space="preserve">and visualization. Establishes the reproducible workflow discipline—verifiable,</w:t>
+      </w:r>
+      <w:r>
+        <w:t xml:space="preserve"> </w:t>
+      </w:r>
+      <w:r>
+        <w:t xml:space="preserve">repeatable, and consistent with best practices—directly applied to the</w:t>
+      </w:r>
+      <w:r>
+        <w:t xml:space="preserve"> </w:t>
+      </w:r>
+      <w:r>
+        <w:t xml:space="preserve">Bronze-to-Gold APCD preprocessing pipeline and Monte Carlo Cross-Validation</w:t>
+      </w:r>
+      <w:r>
+        <w:t xml:space="preserve"> </w:t>
+      </w:r>
+      <w:r>
+        <w:t xml:space="preserve">harness.</w:t>
       </w:r>
     </w:p>
     <w:p>
@@ -1892,19 +1916,56 @@
           <w:b/>
           <w:bCs/>
         </w:rPr>
-        <w:t xml:space="preserve">HGEN 691 – Methods in Data Science</w:t>
-      </w:r>
-      <w:r>
-        <w:t xml:space="preserve"> </w:t>
-      </w:r>
-      <w:r>
-        <w:t xml:space="preserve">(Spring 2020, A): Advanced feature</w:t>
-      </w:r>
-      <w:r>
-        <w:t xml:space="preserve"> </w:t>
-      </w:r>
-      <w:r>
-        <w:t xml:space="preserve">engineering and pipeline design for large-scale biomedical datasets.</w:t>
+        <w:t xml:space="preserve">HGEN 612 – Data Science II</w:t>
+      </w:r>
+      <w:r>
+        <w:t xml:space="preserve"> </w:t>
+      </w:r>
+      <w:r>
+        <w:t xml:space="preserve">(Spring 2021,</w:t>
+      </w:r>
+      <w:r>
+        <w:t xml:space="preserve"> </w:t>
+      </w:r>
+      <w:r>
+        <w:rPr>
+          <w:i/>
+          <w:iCs/>
+        </w:rPr>
+        <w:t xml:space="preserve">grade pending transcript</w:t>
+      </w:r>
+      <w:r>
+        <w:t xml:space="preserve">): Advanced techniques</w:t>
+      </w:r>
+      <w:r>
+        <w:t xml:space="preserve"> </w:t>
+      </w:r>
+      <w:r>
+        <w:t xml:space="preserve">for reproducible data products, tidymodel-based ML workflow automation,</w:t>
+      </w:r>
+      <w:r>
+        <w:t xml:space="preserve"> </w:t>
+      </w:r>
+      <w:r>
+        <w:t xml:space="preserve">production-ready application development, and Git-based project management.</w:t>
+      </w:r>
+      <w:r>
+        <w:t xml:space="preserve"> </w:t>
+      </w:r>
+      <w:r>
+        <w:t xml:space="preserve">The ML automation and open/reproducible data product principles directly inform</w:t>
+      </w:r>
+      <w:r>
+        <w:t xml:space="preserve"> </w:t>
+      </w:r>
+      <w:r>
+        <w:t xml:space="preserve">the Optuna-tuned GBDT pipeline (Aim 1 &amp; 2) and the GitHub-based CI/CD</w:t>
+      </w:r>
+      <w:r>
+        <w:t xml:space="preserve"> </w:t>
+      </w:r>
+      <w:r>
+        <w:t xml:space="preserve">deployment architecture (Aim 3).</w:t>
       </w:r>
     </w:p>
     <w:p>
@@ -1920,19 +1981,19 @@
           <w:b/>
           <w:bCs/>
         </w:rPr>
-        <w:t xml:space="preserve">BIOS 572 – Biomedical Data I</w:t>
-      </w:r>
-      <w:r>
-        <w:t xml:space="preserve"> </w:t>
-      </w:r>
-      <w:r>
-        <w:t xml:space="preserve">(Fall 2019, B): Statistical methods for</w:t>
-      </w:r>
-      <w:r>
-        <w:t xml:space="preserve"> </w:t>
-      </w:r>
-      <w:r>
-        <w:t xml:space="preserve">large-scale biomedical datasets applied to ADE risk assessment.</w:t>
+        <w:t xml:space="preserve">HGEN 691 – Methods in Data Science</w:t>
+      </w:r>
+      <w:r>
+        <w:t xml:space="preserve"> </w:t>
+      </w:r>
+      <w:r>
+        <w:t xml:space="preserve">(Spring 2020, A): Advanced feature</w:t>
+      </w:r>
+      <w:r>
+        <w:t xml:space="preserve"> </w:t>
+      </w:r>
+      <w:r>
+        <w:t xml:space="preserve">engineering and pipeline design for large-scale biomedical datasets.</w:t>
       </w:r>
     </w:p>
     <w:p>
@@ -1948,6 +2009,34 @@
           <w:b/>
           <w:bCs/>
         </w:rPr>
+        <w:t xml:space="preserve">BIOS 572 – Biomedical Data I</w:t>
+      </w:r>
+      <w:r>
+        <w:t xml:space="preserve"> </w:t>
+      </w:r>
+      <w:r>
+        <w:t xml:space="preserve">(Fall 2019, B): Statistical methods for</w:t>
+      </w:r>
+      <w:r>
+        <w:t xml:space="preserve"> </w:t>
+      </w:r>
+      <w:r>
+        <w:t xml:space="preserve">large-scale biomedical datasets applied to ADE risk assessment.</w:t>
+      </w:r>
+    </w:p>
+    <w:p>
+      <w:pPr>
+        <w:pStyle w:val="Compact"/>
+        <w:numPr>
+          <w:ilvl w:val="0"/>
+          <w:numId w:val="1001"/>
+        </w:numPr>
+      </w:pPr>
+      <w:r>
+        <w:rPr>
+          <w:b/>
+          <w:bCs/>
+        </w:rPr>
         <w:t xml:space="preserve">FMBA 614/615/616 – Health Care Management I–III</w:t>
       </w:r>
       <w:r>
@@ -2433,13 +2522,53 @@
         <w:t xml:space="preserve"> </w:t>
       </w:r>
       <w:r>
-        <w:t xml:space="preserve">(Fall 2019, C): Population-level genomic</w:t>
-      </w:r>
-      <w:r>
-        <w:t xml:space="preserve"> </w:t>
-      </w:r>
-      <w:r>
-        <w:t xml:space="preserve">variation informing CPIC Level A/B feature engineering.</w:t>
+        <w:t xml:space="preserve">(Fall 2019, C): Genetic architecture,</w:t>
+      </w:r>
+      <w:r>
+        <w:t xml:space="preserve"> </w:t>
+      </w:r>
+      <w:r>
+        <w:t xml:space="preserve">genotype-environment interaction, statistical methods, and computer algorithms</w:t>
+      </w:r>
+      <w:r>
+        <w:t xml:space="preserve"> </w:t>
+      </w:r>
+      <w:r>
+        <w:t xml:space="preserve">for genetic data analysis. The emphasis on</w:t>
+      </w:r>
+      <w:r>
+        <w:t xml:space="preserve"> </w:t>
+      </w:r>
+      <w:r>
+        <w:rPr>
+          <w:i/>
+          <w:iCs/>
+        </w:rPr>
+        <w:t xml:space="preserve">resolving cause from effect</w:t>
+      </w:r>
+      <w:r>
+        <w:t xml:space="preserve"> </w:t>
+      </w:r>
+      <w:r>
+        <w:t xml:space="preserve">in</w:t>
+      </w:r>
+      <w:r>
+        <w:t xml:space="preserve"> </w:t>
+      </w:r>
+      <w:r>
+        <w:t xml:space="preserve">genetic studies directly informs the Consensus-Causal Filter design; the</w:t>
+      </w:r>
+      <w:r>
+        <w:t xml:space="preserve"> </w:t>
+      </w:r>
+      <w:r>
+        <w:t xml:space="preserve">genotype-environment interaction framework supports CPIC Level A/B feature</w:t>
+      </w:r>
+      <w:r>
+        <w:t xml:space="preserve"> </w:t>
+      </w:r>
+      <w:r>
+        <w:t xml:space="preserve">engineering from administrative ICD/NDC codes.</w:t>
       </w:r>
     </w:p>
     <w:p>

</xml_diff>

<commit_message>
F31: Solutions Architect cert Associate -> Professional
</commit_message>
<xml_diff>
--- a/f31_proposal/output/F31_Dixon_Proposal.docx
+++ b/f31_proposal/output/F31_Dixon_Proposal.docx
@@ -2390,7 +2390,7 @@
           <w:b/>
           <w:bCs/>
         </w:rPr>
-        <w:t xml:space="preserve">AWS Certified Solutions Architect – Associate</w:t>
+        <w:t xml:space="preserve">AWS Certified Solutions Architect – Professional</w:t>
       </w:r>
       <w:r>
         <w:rPr>
@@ -3648,7 +3648,7 @@
         <w:t xml:space="preserve"> </w:t>
       </w:r>
       <w:r>
-        <w:t xml:space="preserve">AWS Certified Solutions Architect – Associate</w:t>
+        <w:t xml:space="preserve">AWS Certified Solutions Architect – Professional</w:t>
       </w:r>
       <w:r>
         <w:t xml:space="preserve">. Published online 2021.</w:t>

</xml_diff>

<commit_message>
F31: consolidate HGEN 612 into HGEN 691; fix age band cohort ranges to 13-114 both cohorts
</commit_message>
<xml_diff>
--- a/f31_proposal/output/F31_Dixon_Proposal.docx
+++ b/f31_proposal/output/F31_Dixon_Proposal.docx
@@ -1193,13 +1193,13 @@
         <w:pStyle w:val="BodyText"/>
       </w:pPr>
       <w:r>
-        <w:t xml:space="preserve">Fifteen Age Band × Cohort partitions (opioid-related ED: 13–64; non-opioid ED:</w:t>
-      </w:r>
-      <w:r>
-        <w:t xml:space="preserve"> </w:t>
-      </w:r>
-      <w:r>
-        <w:t xml:space="preserve">65–114) are processed in parallel, achieving 15.1× throughput improvement over</w:t>
+        <w:t xml:space="preserve">Fourteen Age Band × Cohort partitions (opioid-related ED: 13–114; non-opioid ED:</w:t>
+      </w:r>
+      <w:r>
+        <w:t xml:space="preserve"> </w:t>
+      </w:r>
+      <w:r>
+        <w:t xml:space="preserve">13–114) are processed in parallel, achieving 15.1× throughput improvement over</w:t>
       </w:r>
       <w:r>
         <w:t xml:space="preserve"> </w:t>
@@ -1916,84 +1916,43 @@
           <w:b/>
           <w:bCs/>
         </w:rPr>
-        <w:t xml:space="preserve">HGEN 612 – Data Science II</w:t>
-      </w:r>
-      <w:r>
-        <w:t xml:space="preserve"> </w:t>
-      </w:r>
-      <w:r>
-        <w:t xml:space="preserve">(Spring 2021,</w:t>
-      </w:r>
-      <w:r>
-        <w:t xml:space="preserve"> </w:t>
-      </w:r>
-      <w:r>
-        <w:rPr>
-          <w:i/>
-          <w:iCs/>
-        </w:rPr>
-        <w:t xml:space="preserve">grade pending transcript</w:t>
-      </w:r>
-      <w:r>
-        <w:t xml:space="preserve">): Advanced techniques</w:t>
-      </w:r>
-      <w:r>
-        <w:t xml:space="preserve"> </w:t>
-      </w:r>
-      <w:r>
-        <w:t xml:space="preserve">for reproducible data products, tidymodel-based ML workflow automation,</w:t>
-      </w:r>
-      <w:r>
-        <w:t xml:space="preserve"> </w:t>
-      </w:r>
-      <w:r>
-        <w:t xml:space="preserve">production-ready application development, and Git-based project management.</w:t>
-      </w:r>
-      <w:r>
-        <w:t xml:space="preserve"> </w:t>
-      </w:r>
-      <w:r>
-        <w:t xml:space="preserve">The ML automation and open/reproducible data product principles directly inform</w:t>
-      </w:r>
-      <w:r>
-        <w:t xml:space="preserve"> </w:t>
-      </w:r>
-      <w:r>
-        <w:t xml:space="preserve">the Optuna-tuned GBDT pipeline (Aim 1 &amp; 2) and the GitHub-based CI/CD</w:t>
+        <w:t xml:space="preserve">HGEN 691 – Methods in Data Science</w:t>
+      </w:r>
+      <w:r>
+        <w:t xml:space="preserve"> </w:t>
+      </w:r>
+      <w:r>
+        <w:t xml:space="preserve">(Spring 2020, A; precursor to HGEN 612):</w:t>
+      </w:r>
+      <w:r>
+        <w:t xml:space="preserve"> </w:t>
+      </w:r>
+      <w:r>
+        <w:t xml:space="preserve">Advanced techniques for reproducible data products, tidymodel-based ML workflow</w:t>
+      </w:r>
+      <w:r>
+        <w:t xml:space="preserve"> </w:t>
+      </w:r>
+      <w:r>
+        <w:t xml:space="preserve">automation, production-ready application development, and Git-based project</w:t>
+      </w:r>
+      <w:r>
+        <w:t xml:space="preserve"> </w:t>
+      </w:r>
+      <w:r>
+        <w:t xml:space="preserve">management. ML automation and open/reproducible data product principles directly</w:t>
+      </w:r>
+      <w:r>
+        <w:t xml:space="preserve"> </w:t>
+      </w:r>
+      <w:r>
+        <w:t xml:space="preserve">inform the Optuna-tuned GBDT pipeline (Aims 1 &amp; 2) and the GitHub-based CI/CD</w:t>
       </w:r>
       <w:r>
         <w:t xml:space="preserve"> </w:t>
       </w:r>
       <w:r>
         <w:t xml:space="preserve">deployment architecture (Aim 3).</w:t>
-      </w:r>
-    </w:p>
-    <w:p>
-      <w:pPr>
-        <w:pStyle w:val="Compact"/>
-        <w:numPr>
-          <w:ilvl w:val="0"/>
-          <w:numId w:val="1001"/>
-        </w:numPr>
-      </w:pPr>
-      <w:r>
-        <w:rPr>
-          <w:b/>
-          <w:bCs/>
-        </w:rPr>
-        <w:t xml:space="preserve">HGEN 691 – Methods in Data Science</w:t>
-      </w:r>
-      <w:r>
-        <w:t xml:space="preserve"> </w:t>
-      </w:r>
-      <w:r>
-        <w:t xml:space="preserve">(Spring 2020, A): Advanced feature</w:t>
-      </w:r>
-      <w:r>
-        <w:t xml:space="preserve"> </w:t>
-      </w:r>
-      <w:r>
-        <w:t xml:space="preserve">engineering and pipeline design for large-scale biomedical datasets.</w:t>
       </w:r>
     </w:p>
     <w:p>

</xml_diff>